<commit_message>
TCMK fixes + JVM Heating
</commit_message>
<xml_diff>
--- a/Five/TCMK/Lab1/МихайличТЧМК_Лаб1.docx
+++ b/Five/TCMK/Lab1/МихайличТЧМК_Лаб1.docx
@@ -12665,7 +12665,11 @@
         <w:t>Третьи входные данные. Расширенный алгоритм Евклида с усеченными остатками.</w:t>
       </w:r>
     </w:p>
-    <w:p/>
+    <w:p>
+      <w:pPr>
+        <w:ind w:firstLine="0"/>
+      </w:pPr>
+    </w:p>
     <w:tbl>
       <w:tblPr>
         <w:tblStyle w:val="TableGrid"/>
@@ -12924,9 +12928,13 @@
           <w:p>
             <w:pPr>
               <w:ind w:firstLine="0"/>
-            </w:pPr>
-            <w:r>
-              <w:t>0,0005172</w:t>
+              <w:jc w:val="center"/>
+            </w:pPr>
+            <w:r>
+              <w:t>0,01</w:t>
+            </w:r>
+            <w:r>
+              <w:t>0</w:t>
             </w:r>
           </w:p>
         </w:tc>
@@ -12937,6 +12945,102 @@
           <w:p>
             <w:pPr>
               <w:ind w:firstLine="0"/>
+            </w:pPr>
+            <w:r>
+              <w:rPr>
+                <w:lang w:val="en-US"/>
+              </w:rPr>
+              <w:t>23</w:t>
+            </w:r>
+            <w:r>
+              <w:t xml:space="preserve"> (</w:t>
+            </w:r>
+            <w:r>
+              <w:t>75</w:t>
+            </w:r>
+            <w:r>
+              <w:t>)</w:t>
+            </w:r>
+          </w:p>
+        </w:tc>
+        <w:tc>
+          <w:tcPr>
+            <w:tcW w:w="1448" w:type="dxa"/>
+          </w:tcPr>
+          <w:p>
+            <w:pPr>
+              <w:ind w:firstLine="0"/>
+              <w:jc w:val="center"/>
+            </w:pPr>
+            <w:r>
+              <w:t>0,0</w:t>
+            </w:r>
+            <w:r>
+              <w:t>27</w:t>
+            </w:r>
+          </w:p>
+        </w:tc>
+        <w:tc>
+          <w:tcPr>
+            <w:tcW w:w="1449" w:type="dxa"/>
+          </w:tcPr>
+          <w:p>
+            <w:pPr>
+              <w:ind w:firstLine="0"/>
+              <w:rPr>
+                <w:lang w:val="en-US"/>
+              </w:rPr>
+            </w:pPr>
+            <w:r>
+              <w:rPr>
+                <w:lang w:val="en-US"/>
+              </w:rPr>
+              <w:t>14</w:t>
+            </w:r>
+          </w:p>
+        </w:tc>
+        <w:tc>
+          <w:tcPr>
+            <w:tcW w:w="1449" w:type="dxa"/>
+          </w:tcPr>
+          <w:p>
+            <w:pPr>
+              <w:ind w:firstLine="0"/>
+              <w:jc w:val="center"/>
+            </w:pPr>
+            <w:r>
+              <w:t>0,00</w:t>
+            </w:r>
+            <w:r>
+              <w:t>8</w:t>
+            </w:r>
+          </w:p>
+        </w:tc>
+      </w:tr>
+      <w:tr>
+        <w:tc>
+          <w:tcPr>
+            <w:tcW w:w="1448" w:type="dxa"/>
+          </w:tcPr>
+          <w:p>
+            <w:pPr>
+              <w:ind w:firstLine="0"/>
+            </w:pPr>
+            <w:r>
+              <w:t>2</w:t>
+            </w:r>
+          </w:p>
+        </w:tc>
+        <w:tc>
+          <w:tcPr>
+            <w:tcW w:w="1448" w:type="dxa"/>
+          </w:tcPr>
+          <w:p>
+            <w:pPr>
+              <w:ind w:firstLine="0"/>
+              <w:rPr>
+                <w:lang w:val="en-US"/>
+              </w:rPr>
             </w:pPr>
             <w:r>
               <w:rPr>
@@ -12944,15 +13048,6 @@
               </w:rPr>
               <w:t>39</w:t>
             </w:r>
-            <w:r>
-              <w:t xml:space="preserve"> (</w:t>
-            </w:r>
-            <w:r>
-              <w:t>75</w:t>
-            </w:r>
-            <w:r>
-              <w:t>)</w:t>
-            </w:r>
           </w:p>
         </w:tc>
         <w:tc>
@@ -12962,15 +13057,19 @@
           <w:p>
             <w:pPr>
               <w:ind w:firstLine="0"/>
-            </w:pPr>
-            <w:r>
-              <w:t>0,0001743</w:t>
-            </w:r>
-          </w:p>
-        </w:tc>
-        <w:tc>
-          <w:tcPr>
-            <w:tcW w:w="1449" w:type="dxa"/>
+              <w:jc w:val="center"/>
+            </w:pPr>
+            <w:r>
+              <w:t>0,01</w:t>
+            </w:r>
+            <w:r>
+              <w:t>4</w:t>
+            </w:r>
+          </w:p>
+        </w:tc>
+        <w:tc>
+          <w:tcPr>
+            <w:tcW w:w="1448" w:type="dxa"/>
           </w:tcPr>
           <w:p>
             <w:pPr>
@@ -12983,13 +13082,25 @@
               <w:rPr>
                 <w:lang w:val="en-US"/>
               </w:rPr>
-              <w:t>70</w:t>
-            </w:r>
-          </w:p>
-        </w:tc>
-        <w:tc>
-          <w:tcPr>
-            <w:tcW w:w="1449" w:type="dxa"/>
+              <w:t xml:space="preserve">49 </w:t>
+            </w:r>
+            <w:r>
+              <w:t>(</w:t>
+            </w:r>
+            <w:r>
+              <w:t>141</w:t>
+            </w:r>
+            <w:r>
+              <w:rPr>
+                <w:lang w:val="en-US"/>
+              </w:rPr>
+              <w:t>)</w:t>
+            </w:r>
+          </w:p>
+        </w:tc>
+        <w:tc>
+          <w:tcPr>
+            <w:tcW w:w="1448" w:type="dxa"/>
           </w:tcPr>
           <w:p>
             <w:pPr>
@@ -12997,28 +13108,16 @@
               <w:jc w:val="center"/>
             </w:pPr>
             <w:r>
-              <w:t>0,0001973</w:t>
-            </w:r>
-          </w:p>
-        </w:tc>
-      </w:tr>
-      <w:tr>
-        <w:tc>
-          <w:tcPr>
-            <w:tcW w:w="1448" w:type="dxa"/>
-          </w:tcPr>
-          <w:p>
-            <w:pPr>
-              <w:ind w:firstLine="0"/>
-            </w:pPr>
-            <w:r>
-              <w:t>2</w:t>
-            </w:r>
-          </w:p>
-        </w:tc>
-        <w:tc>
-          <w:tcPr>
-            <w:tcW w:w="1448" w:type="dxa"/>
+              <w:t>0,07</w:t>
+            </w:r>
+            <w:r>
+              <w:t>8</w:t>
+            </w:r>
+          </w:p>
+        </w:tc>
+        <w:tc>
+          <w:tcPr>
+            <w:tcW w:w="1449" w:type="dxa"/>
           </w:tcPr>
           <w:p>
             <w:pPr>
@@ -13031,10 +13130,29 @@
               <w:rPr>
                 <w:lang w:val="en-US"/>
               </w:rPr>
-              <w:t>21</w:t>
-            </w:r>
-          </w:p>
-        </w:tc>
+              <w:t>29</w:t>
+            </w:r>
+          </w:p>
+        </w:tc>
+        <w:tc>
+          <w:tcPr>
+            <w:tcW w:w="1449" w:type="dxa"/>
+          </w:tcPr>
+          <w:p>
+            <w:pPr>
+              <w:ind w:firstLine="0"/>
+              <w:jc w:val="center"/>
+            </w:pPr>
+            <w:r>
+              <w:t>0,01</w:t>
+            </w:r>
+            <w:r>
+              <w:t>4</w:t>
+            </w:r>
+          </w:p>
+        </w:tc>
+      </w:tr>
+      <w:tr>
         <w:tc>
           <w:tcPr>
             <w:tcW w:w="1448" w:type="dxa"/>
@@ -13044,7 +13162,7 @@
               <w:ind w:firstLine="0"/>
             </w:pPr>
             <w:r>
-              <w:t>0,0006421</w:t>
+              <w:t>3</w:t>
             </w:r>
           </w:p>
         </w:tc>
@@ -13063,13 +13181,58 @@
               <w:rPr>
                 <w:lang w:val="en-US"/>
               </w:rPr>
-              <w:t>47</w:t>
-            </w:r>
-            <w:r>
+              <w:t>70</w:t>
+            </w:r>
+          </w:p>
+        </w:tc>
+        <w:tc>
+          <w:tcPr>
+            <w:tcW w:w="1448" w:type="dxa"/>
+          </w:tcPr>
+          <w:p>
+            <w:pPr>
+              <w:ind w:firstLine="0"/>
+              <w:jc w:val="center"/>
+              <w:rPr>
+                <w:lang w:val="en-US"/>
+              </w:rPr>
+            </w:pPr>
+            <w:r>
+              <w:t>0,03</w:t>
+            </w:r>
+            <w:r>
+              <w:t>6</w:t>
+            </w:r>
+          </w:p>
+        </w:tc>
+        <w:tc>
+          <w:tcPr>
+            <w:tcW w:w="1448" w:type="dxa"/>
+          </w:tcPr>
+          <w:p>
+            <w:pPr>
+              <w:ind w:firstLine="0"/>
+              <w:rPr>
+                <w:lang w:val="en-US"/>
+              </w:rPr>
+            </w:pPr>
+            <w:r>
+              <w:rPr>
+                <w:lang w:val="en-US"/>
+              </w:rPr>
+              <w:t>96</w:t>
+            </w:r>
+            <w:r>
+              <w:rPr>
+                <w:lang w:val="en-US"/>
+              </w:rPr>
               <w:t xml:space="preserve"> (</w:t>
             </w:r>
             <w:r>
-              <w:t>141</w:t>
+              <w:rPr>
+                <w:lang w:val="en-US"/>
+              </w:rPr>
+              <w:t>278</w:t>
             </w:r>
             <w:r>
               <w:rPr>
@@ -13086,9 +13249,13 @@
           <w:p>
             <w:pPr>
               <w:ind w:firstLine="0"/>
-            </w:pPr>
-            <w:r>
-              <w:t>0,0004546</w:t>
+              <w:jc w:val="center"/>
+            </w:pPr>
+            <w:r>
+              <w:t>0,1</w:t>
+            </w:r>
+            <w:r>
+              <w:t>14</w:t>
             </w:r>
           </w:p>
         </w:tc>
@@ -13107,7 +13274,7 @@
               <w:rPr>
                 <w:lang w:val="en-US"/>
               </w:rPr>
-              <w:t>94</w:t>
+              <w:t>51</w:t>
             </w:r>
           </w:p>
         </w:tc>
@@ -13121,136 +13288,10 @@
               <w:jc w:val="center"/>
             </w:pPr>
             <w:r>
-              <w:t>0,0003077</w:t>
-            </w:r>
-          </w:p>
-        </w:tc>
-      </w:tr>
-      <w:tr>
-        <w:tc>
-          <w:tcPr>
-            <w:tcW w:w="1448" w:type="dxa"/>
-          </w:tcPr>
-          <w:p>
-            <w:pPr>
-              <w:ind w:firstLine="0"/>
-            </w:pPr>
-            <w:r>
-              <w:t>3</w:t>
-            </w:r>
-          </w:p>
-        </w:tc>
-        <w:tc>
-          <w:tcPr>
-            <w:tcW w:w="1448" w:type="dxa"/>
-          </w:tcPr>
-          <w:p>
-            <w:pPr>
-              <w:ind w:firstLine="0"/>
-              <w:rPr>
-                <w:lang w:val="en-US"/>
-              </w:rPr>
-            </w:pPr>
-            <w:r>
-              <w:rPr>
-                <w:lang w:val="en-US"/>
-              </w:rPr>
-              <w:t>14</w:t>
-            </w:r>
-          </w:p>
-        </w:tc>
-        <w:tc>
-          <w:tcPr>
-            <w:tcW w:w="1448" w:type="dxa"/>
-          </w:tcPr>
-          <w:p>
-            <w:pPr>
-              <w:ind w:firstLine="0"/>
-            </w:pPr>
-            <w:r>
-              <w:t>0,0001138</w:t>
-            </w:r>
-          </w:p>
-        </w:tc>
-        <w:tc>
-          <w:tcPr>
-            <w:tcW w:w="1448" w:type="dxa"/>
-          </w:tcPr>
-          <w:p>
-            <w:pPr>
-              <w:ind w:firstLine="0"/>
-              <w:rPr>
-                <w:lang w:val="en-US"/>
-              </w:rPr>
-            </w:pPr>
-            <w:r>
-              <w:rPr>
-                <w:lang w:val="en-US"/>
-              </w:rPr>
-              <w:t>29</w:t>
-            </w:r>
-            <w:r>
-              <w:rPr>
-                <w:lang w:val="en-US"/>
-              </w:rPr>
-              <w:t xml:space="preserve"> (</w:t>
-            </w:r>
-            <w:r>
-              <w:rPr>
-                <w:lang w:val="en-US"/>
-              </w:rPr>
-              <w:t>278</w:t>
-            </w:r>
-            <w:r>
-              <w:rPr>
-                <w:lang w:val="en-US"/>
-              </w:rPr>
-              <w:t>)</w:t>
-            </w:r>
-          </w:p>
-        </w:tc>
-        <w:tc>
-          <w:tcPr>
-            <w:tcW w:w="1448" w:type="dxa"/>
-          </w:tcPr>
-          <w:p>
-            <w:pPr>
-              <w:ind w:firstLine="0"/>
-            </w:pPr>
-            <w:r>
-              <w:t>0,0002786</w:t>
-            </w:r>
-          </w:p>
-        </w:tc>
-        <w:tc>
-          <w:tcPr>
-            <w:tcW w:w="1449" w:type="dxa"/>
-          </w:tcPr>
-          <w:p>
-            <w:pPr>
-              <w:ind w:firstLine="0"/>
-              <w:rPr>
-                <w:lang w:val="en-US"/>
-              </w:rPr>
-            </w:pPr>
-            <w:r>
-              <w:rPr>
-                <w:lang w:val="en-US"/>
-              </w:rPr>
-              <w:t>51</w:t>
-            </w:r>
-          </w:p>
-        </w:tc>
-        <w:tc>
-          <w:tcPr>
-            <w:tcW w:w="1449" w:type="dxa"/>
-          </w:tcPr>
-          <w:p>
-            <w:pPr>
-              <w:ind w:firstLine="0"/>
-            </w:pPr>
-            <w:r>
-              <w:t>0,0001903</w:t>
+              <w:t>0,02</w:t>
+            </w:r>
+            <w:r>
+              <w:t>2</w:t>
             </w:r>
           </w:p>
         </w:tc>
@@ -13266,6 +13307,69 @@
     </w:p>
     <w:p/>
     <w:p>
+      <w:r>
+        <w:t>Время работы алгоритмов было взято как среднее арифметическое из 300 запусков</w:t>
+      </w:r>
+      <w:r>
+        <w:t xml:space="preserve"> скомпилированного </w:t>
+      </w:r>
+      <w:r>
+        <w:t>.</w:t>
+      </w:r>
+      <w:r>
+        <w:rPr>
+          <w:lang w:val="en-US"/>
+        </w:rPr>
+        <w:t>class</w:t>
+      </w:r>
+      <w:r>
+        <w:t xml:space="preserve"> </w:t>
+      </w:r>
+      <w:r>
+        <w:t>файла</w:t>
+      </w:r>
+      <w:r>
+        <w:t xml:space="preserve"> без </w:t>
+      </w:r>
+      <w:r>
+        <w:t>индексации итераций</w:t>
+      </w:r>
+      <w:r>
+        <w:t xml:space="preserve"> </w:t>
+      </w:r>
+      <w:r>
+        <w:t xml:space="preserve">и предварительным разгоном </w:t>
+      </w:r>
+      <w:r>
+        <w:rPr>
+          <w:lang w:val="en-US"/>
+        </w:rPr>
+        <w:t>Java</w:t>
+      </w:r>
+      <w:r>
+        <w:t xml:space="preserve"> </w:t>
+      </w:r>
+      <w:r>
+        <w:rPr>
+          <w:lang w:val="en-US"/>
+        </w:rPr>
+        <w:t>Virtual</w:t>
+      </w:r>
+      <w:r>
+        <w:t xml:space="preserve"> </w:t>
+      </w:r>
+      <w:r>
+        <w:rPr>
+          <w:lang w:val="en-US"/>
+        </w:rPr>
+        <w:t>Machine</w:t>
+      </w:r>
+      <w:r>
+        <w:t>.</w:t>
+      </w:r>
+    </w:p>
+    <w:p/>
+    <w:p>
       <w:pPr>
         <w:pStyle w:val="a9"/>
       </w:pPr>
@@ -13329,6 +13433,7 @@
         <w:ind w:firstLine="0"/>
       </w:pPr>
       <w:r>
+        <w:lastRenderedPageBreak/>
         <w:br w:type="page"/>
       </w:r>
     </w:p>

</xml_diff>